<commit_message>
Fix download order for expence
</commit_message>
<xml_diff>
--- a/public/files/contract_order_out_template.docx
+++ b/public/files/contract_order_out_template.docx
@@ -126,34 +126,14 @@
                                     <w:szCs w:val="16"/>
                                   </w:rPr>
                                 </w:pPr>
-                                <w:proofErr w:type="spellStart"/>
                                 <w:r>
                                   <w:rPr>
                                     <w:rFonts w:ascii="Sylfaen" w:hAnsi="Sylfaen"/>
                                     <w:sz w:val="16"/>
                                     <w:szCs w:val="16"/>
                                   </w:rPr>
-                                  <w:t>Ելքագրվող</w:t>
+                                  <w:t>Ելքագրվող հաշվեհամար</w:t>
                                 </w:r>
-                                <w:proofErr w:type="spellEnd"/>
-                                <w:r>
-                                  <w:rPr>
-                                    <w:rFonts w:ascii="Sylfaen" w:hAnsi="Sylfaen"/>
-                                    <w:sz w:val="16"/>
-                                    <w:szCs w:val="16"/>
-                                  </w:rPr>
-                                  <w:t xml:space="preserve"> </w:t>
-                                </w:r>
-                                <w:proofErr w:type="spellStart"/>
-                                <w:r>
-                                  <w:rPr>
-                                    <w:rFonts w:ascii="Sylfaen" w:hAnsi="Sylfaen"/>
-                                    <w:sz w:val="16"/>
-                                    <w:szCs w:val="16"/>
-                                  </w:rPr>
-                                  <w:t>հաշվեհամար</w:t>
-                                </w:r>
-                                <w:proofErr w:type="spellEnd"/>
                               </w:p>
                             </w:txbxContent>
                           </wps:txbx>
@@ -291,34 +271,14 @@
                                     <w:szCs w:val="16"/>
                                   </w:rPr>
                                 </w:pPr>
-                                <w:proofErr w:type="spellStart"/>
                                 <w:r>
                                   <w:rPr>
                                     <w:rFonts w:ascii="Sylfaen" w:hAnsi="Sylfaen"/>
                                     <w:sz w:val="16"/>
                                     <w:szCs w:val="16"/>
                                   </w:rPr>
-                                  <w:t>Մուտքագրվող</w:t>
+                                  <w:t>Մուտքագրվող հաշվեհամար</w:t>
                                 </w:r>
-                                <w:proofErr w:type="spellEnd"/>
-                                <w:r>
-                                  <w:rPr>
-                                    <w:rFonts w:ascii="Sylfaen" w:hAnsi="Sylfaen"/>
-                                    <w:sz w:val="16"/>
-                                    <w:szCs w:val="16"/>
-                                  </w:rPr>
-                                  <w:t xml:space="preserve"> </w:t>
-                                </w:r>
-                                <w:proofErr w:type="spellStart"/>
-                                <w:r>
-                                  <w:rPr>
-                                    <w:rFonts w:ascii="Sylfaen" w:hAnsi="Sylfaen"/>
-                                    <w:sz w:val="16"/>
-                                    <w:szCs w:val="16"/>
-                                  </w:rPr>
-                                  <w:t>հաշվեհամար</w:t>
-                                </w:r>
-                                <w:proofErr w:type="spellEnd"/>
                               </w:p>
                             </w:txbxContent>
                           </wps:txbx>
@@ -410,34 +370,14 @@
                               <w:szCs w:val="16"/>
                             </w:rPr>
                           </w:pPr>
-                          <w:proofErr w:type="spellStart"/>
                           <w:r>
                             <w:rPr>
                               <w:rFonts w:ascii="Sylfaen" w:hAnsi="Sylfaen"/>
                               <w:sz w:val="16"/>
                               <w:szCs w:val="16"/>
                             </w:rPr>
-                            <w:t>Ելքագրվող</w:t>
+                            <w:t>Ելքագրվող հաշվեհամար</w:t>
                           </w:r>
-                          <w:proofErr w:type="spellEnd"/>
-                          <w:r>
-                            <w:rPr>
-                              <w:rFonts w:ascii="Sylfaen" w:hAnsi="Sylfaen"/>
-                              <w:sz w:val="16"/>
-                              <w:szCs w:val="16"/>
-                            </w:rPr>
-                            <w:t xml:space="preserve"> </w:t>
-                          </w:r>
-                          <w:proofErr w:type="spellStart"/>
-                          <w:r>
-                            <w:rPr>
-                              <w:rFonts w:ascii="Sylfaen" w:hAnsi="Sylfaen"/>
-                              <w:sz w:val="16"/>
-                              <w:szCs w:val="16"/>
-                            </w:rPr>
-                            <w:t>հաշվեհամար</w:t>
-                          </w:r>
-                          <w:proofErr w:type="spellEnd"/>
                         </w:p>
                       </w:txbxContent>
                     </v:textbox>
@@ -486,34 +426,14 @@
                               <w:szCs w:val="16"/>
                             </w:rPr>
                           </w:pPr>
-                          <w:proofErr w:type="spellStart"/>
                           <w:r>
                             <w:rPr>
                               <w:rFonts w:ascii="Sylfaen" w:hAnsi="Sylfaen"/>
                               <w:sz w:val="16"/>
                               <w:szCs w:val="16"/>
                             </w:rPr>
-                            <w:t>Մուտքագրվող</w:t>
+                            <w:t>Մուտքագրվող հաշվեհամար</w:t>
                           </w:r>
-                          <w:proofErr w:type="spellEnd"/>
-                          <w:r>
-                            <w:rPr>
-                              <w:rFonts w:ascii="Sylfaen" w:hAnsi="Sylfaen"/>
-                              <w:sz w:val="16"/>
-                              <w:szCs w:val="16"/>
-                            </w:rPr>
-                            <w:t xml:space="preserve"> </w:t>
-                          </w:r>
-                          <w:proofErr w:type="spellStart"/>
-                          <w:r>
-                            <w:rPr>
-                              <w:rFonts w:ascii="Sylfaen" w:hAnsi="Sylfaen"/>
-                              <w:sz w:val="16"/>
-                              <w:szCs w:val="16"/>
-                            </w:rPr>
-                            <w:t>հաշվեհամար</w:t>
-                          </w:r>
-                          <w:proofErr w:type="spellEnd"/>
                         </w:p>
                       </w:txbxContent>
                     </v:textbox>
@@ -920,23 +840,13 @@
                                   <w:szCs w:val="18"/>
                                 </w:rPr>
                               </w:pPr>
-                              <w:proofErr w:type="spellStart"/>
                               <w:r>
                                 <w:rPr>
                                   <w:rFonts w:ascii="Sylfaen" w:hAnsi="Sylfaen"/>
                                   <w:sz w:val="18"/>
                                   <w:szCs w:val="18"/>
                                 </w:rPr>
-                                <w:t>Ամսաթիվ</w:t>
-                              </w:r>
-                              <w:proofErr w:type="spellEnd"/>
-                              <w:r>
-                                <w:rPr>
-                                  <w:rFonts w:ascii="Sylfaen" w:hAnsi="Sylfaen"/>
-                                  <w:sz w:val="18"/>
-                                  <w:szCs w:val="18"/>
-                                </w:rPr>
-                                <w:t xml:space="preserve">՝ </w:t>
+                                <w:t xml:space="preserve">Ամսաթիվ՝ </w:t>
                               </w:r>
                               <w:r>
                                 <w:rPr>
@@ -1125,7 +1035,6 @@
                                     <w:szCs w:val="15"/>
                                   </w:rPr>
                                 </w:pPr>
-                                <w:proofErr w:type="spellStart"/>
                                 <w:r>
                                   <w:rPr>
                                     <w:rFonts w:ascii="Sylfaen" w:hAnsi="Sylfaen"/>
@@ -1134,7 +1043,6 @@
                                   </w:rPr>
                                   <w:t>գումար</w:t>
                                 </w:r>
-                                <w:proofErr w:type="spellEnd"/>
                               </w:p>
                             </w:txbxContent>
                           </wps:txbx>
@@ -1173,34 +1081,14 @@
                                     <w:szCs w:val="15"/>
                                   </w:rPr>
                                 </w:pPr>
-                                <w:proofErr w:type="spellStart"/>
                                 <w:r>
                                   <w:rPr>
                                     <w:rFonts w:ascii="Sylfaen" w:hAnsi="Sylfaen"/>
                                     <w:sz w:val="15"/>
                                     <w:szCs w:val="15"/>
                                   </w:rPr>
-                                  <w:t>գումարը</w:t>
+                                  <w:t>գումարը բառերով</w:t>
                                 </w:r>
-                                <w:proofErr w:type="spellEnd"/>
-                                <w:r>
-                                  <w:rPr>
-                                    <w:rFonts w:ascii="Sylfaen" w:hAnsi="Sylfaen"/>
-                                    <w:sz w:val="15"/>
-                                    <w:szCs w:val="15"/>
-                                  </w:rPr>
-                                  <w:t xml:space="preserve"> </w:t>
-                                </w:r>
-                                <w:proofErr w:type="spellStart"/>
-                                <w:r>
-                                  <w:rPr>
-                                    <w:rFonts w:ascii="Sylfaen" w:hAnsi="Sylfaen"/>
-                                    <w:sz w:val="15"/>
-                                    <w:szCs w:val="15"/>
-                                  </w:rPr>
-                                  <w:t>բառերով</w:t>
-                                </w:r>
-                                <w:proofErr w:type="spellEnd"/>
                               </w:p>
                             </w:txbxContent>
                           </wps:txbx>
@@ -1348,23 +1236,13 @@
                             <w:szCs w:val="18"/>
                           </w:rPr>
                         </w:pPr>
-                        <w:proofErr w:type="spellStart"/>
                         <w:r>
                           <w:rPr>
                             <w:rFonts w:ascii="Sylfaen" w:hAnsi="Sylfaen"/>
                             <w:sz w:val="18"/>
                             <w:szCs w:val="18"/>
                           </w:rPr>
-                          <w:t>Ամսաթիվ</w:t>
-                        </w:r>
-                        <w:proofErr w:type="spellEnd"/>
-                        <w:r>
-                          <w:rPr>
-                            <w:rFonts w:ascii="Sylfaen" w:hAnsi="Sylfaen"/>
-                            <w:sz w:val="18"/>
-                            <w:szCs w:val="18"/>
-                          </w:rPr>
-                          <w:t xml:space="preserve">՝ </w:t>
+                          <w:t xml:space="preserve">Ամսաթիվ՝ </w:t>
                         </w:r>
                         <w:r>
                           <w:rPr>
@@ -1429,7 +1307,6 @@
                               <w:szCs w:val="15"/>
                             </w:rPr>
                           </w:pPr>
-                          <w:proofErr w:type="spellStart"/>
                           <w:r>
                             <w:rPr>
                               <w:rFonts w:ascii="Sylfaen" w:hAnsi="Sylfaen"/>
@@ -1438,7 +1315,6 @@
                             </w:rPr>
                             <w:t>գումար</w:t>
                           </w:r>
-                          <w:proofErr w:type="spellEnd"/>
                         </w:p>
                       </w:txbxContent>
                     </v:textbox>
@@ -1454,34 +1330,14 @@
                               <w:szCs w:val="15"/>
                             </w:rPr>
                           </w:pPr>
-                          <w:proofErr w:type="spellStart"/>
                           <w:r>
                             <w:rPr>
                               <w:rFonts w:ascii="Sylfaen" w:hAnsi="Sylfaen"/>
                               <w:sz w:val="15"/>
                               <w:szCs w:val="15"/>
                             </w:rPr>
-                            <w:t>գումարը</w:t>
+                            <w:t>գումարը բառերով</w:t>
                           </w:r>
-                          <w:proofErr w:type="spellEnd"/>
-                          <w:r>
-                            <w:rPr>
-                              <w:rFonts w:ascii="Sylfaen" w:hAnsi="Sylfaen"/>
-                              <w:sz w:val="15"/>
-                              <w:szCs w:val="15"/>
-                            </w:rPr>
-                            <w:t xml:space="preserve"> </w:t>
-                          </w:r>
-                          <w:proofErr w:type="spellStart"/>
-                          <w:r>
-                            <w:rPr>
-                              <w:rFonts w:ascii="Sylfaen" w:hAnsi="Sylfaen"/>
-                              <w:sz w:val="15"/>
-                              <w:szCs w:val="15"/>
-                            </w:rPr>
-                            <w:t>բառերով</w:t>
-                          </w:r>
-                          <w:proofErr w:type="spellEnd"/>
                         </w:p>
                       </w:txbxContent>
                     </v:textbox>
@@ -1607,25 +1463,14 @@
                                     <w:szCs w:val="16"/>
                                   </w:rPr>
                                 </w:pPr>
-                                <w:proofErr w:type="spellStart"/>
                                 <w:r>
                                   <w:rPr>
                                     <w:rFonts w:ascii="Sylfaen" w:hAnsi="Sylfaen"/>
                                     <w:sz w:val="16"/>
                                     <w:szCs w:val="16"/>
                                   </w:rPr>
-                                  <w:t>Ելքագրվող</w:t>
+                                  <w:t xml:space="preserve">Ելքագրվող </w:t>
                                 </w:r>
-                                <w:proofErr w:type="spellEnd"/>
-                                <w:r>
-                                  <w:rPr>
-                                    <w:rFonts w:ascii="Sylfaen" w:hAnsi="Sylfaen"/>
-                                    <w:sz w:val="16"/>
-                                    <w:szCs w:val="16"/>
-                                  </w:rPr>
-                                  <w:t xml:space="preserve"> </w:t>
-                                </w:r>
-                                <w:proofErr w:type="spellStart"/>
                                 <w:r>
                                   <w:rPr>
                                     <w:rFonts w:ascii="Sylfaen" w:hAnsi="Sylfaen"/>
@@ -1634,7 +1479,6 @@
                                   </w:rPr>
                                   <w:t>հաշվեհամար</w:t>
                                 </w:r>
-                                <w:proofErr w:type="spellEnd"/>
                               </w:p>
                             </w:txbxContent>
                           </wps:txbx>
@@ -1772,34 +1616,14 @@
                                     <w:szCs w:val="16"/>
                                   </w:rPr>
                                 </w:pPr>
-                                <w:proofErr w:type="spellStart"/>
                                 <w:r>
                                   <w:rPr>
                                     <w:rFonts w:ascii="Sylfaen" w:hAnsi="Sylfaen"/>
                                     <w:sz w:val="16"/>
                                     <w:szCs w:val="16"/>
                                   </w:rPr>
-                                  <w:t>Մուտքագրվող</w:t>
+                                  <w:t>Մուտքագրվող հաշվեհամար</w:t>
                                 </w:r>
-                                <w:proofErr w:type="spellEnd"/>
-                                <w:r>
-                                  <w:rPr>
-                                    <w:rFonts w:ascii="Sylfaen" w:hAnsi="Sylfaen"/>
-                                    <w:sz w:val="16"/>
-                                    <w:szCs w:val="16"/>
-                                  </w:rPr>
-                                  <w:t xml:space="preserve"> </w:t>
-                                </w:r>
-                                <w:proofErr w:type="spellStart"/>
-                                <w:r>
-                                  <w:rPr>
-                                    <w:rFonts w:ascii="Sylfaen" w:hAnsi="Sylfaen"/>
-                                    <w:sz w:val="16"/>
-                                    <w:szCs w:val="16"/>
-                                  </w:rPr>
-                                  <w:t>հաշվեհամար</w:t>
-                                </w:r>
-                                <w:proofErr w:type="spellEnd"/>
                               </w:p>
                             </w:txbxContent>
                           </wps:txbx>
@@ -1887,25 +1711,14 @@
                               <w:szCs w:val="16"/>
                             </w:rPr>
                           </w:pPr>
-                          <w:proofErr w:type="spellStart"/>
                           <w:r>
                             <w:rPr>
                               <w:rFonts w:ascii="Sylfaen" w:hAnsi="Sylfaen"/>
                               <w:sz w:val="16"/>
                               <w:szCs w:val="16"/>
                             </w:rPr>
-                            <w:t>Ելքագրվող</w:t>
+                            <w:t xml:space="preserve">Ելքագրվող </w:t>
                           </w:r>
-                          <w:proofErr w:type="spellEnd"/>
-                          <w:r>
-                            <w:rPr>
-                              <w:rFonts w:ascii="Sylfaen" w:hAnsi="Sylfaen"/>
-                              <w:sz w:val="16"/>
-                              <w:szCs w:val="16"/>
-                            </w:rPr>
-                            <w:t xml:space="preserve"> </w:t>
-                          </w:r>
-                          <w:proofErr w:type="spellStart"/>
                           <w:r>
                             <w:rPr>
                               <w:rFonts w:ascii="Sylfaen" w:hAnsi="Sylfaen"/>
@@ -1914,7 +1727,6 @@
                             </w:rPr>
                             <w:t>հաշվեհամար</w:t>
                           </w:r>
-                          <w:proofErr w:type="spellEnd"/>
                         </w:p>
                       </w:txbxContent>
                     </v:textbox>
@@ -1963,34 +1775,14 @@
                               <w:szCs w:val="16"/>
                             </w:rPr>
                           </w:pPr>
-                          <w:proofErr w:type="spellStart"/>
                           <w:r>
                             <w:rPr>
                               <w:rFonts w:ascii="Sylfaen" w:hAnsi="Sylfaen"/>
                               <w:sz w:val="16"/>
                               <w:szCs w:val="16"/>
                             </w:rPr>
-                            <w:t>Մուտքագրվող</w:t>
+                            <w:t>Մուտքագրվող հաշվեհամար</w:t>
                           </w:r>
-                          <w:proofErr w:type="spellEnd"/>
-                          <w:r>
-                            <w:rPr>
-                              <w:rFonts w:ascii="Sylfaen" w:hAnsi="Sylfaen"/>
-                              <w:sz w:val="16"/>
-                              <w:szCs w:val="16"/>
-                            </w:rPr>
-                            <w:t xml:space="preserve"> </w:t>
-                          </w:r>
-                          <w:proofErr w:type="spellStart"/>
-                          <w:r>
-                            <w:rPr>
-                              <w:rFonts w:ascii="Sylfaen" w:hAnsi="Sylfaen"/>
-                              <w:sz w:val="16"/>
-                              <w:szCs w:val="16"/>
-                            </w:rPr>
-                            <w:t>հաշվեհամար</w:t>
-                          </w:r>
-                          <w:proofErr w:type="spellEnd"/>
                         </w:p>
                       </w:txbxContent>
                     </v:textbox>
@@ -2311,7 +2103,6 @@
                                 <w:szCs w:val="15"/>
                               </w:rPr>
                             </w:pPr>
-                            <w:proofErr w:type="spellStart"/>
                             <w:r>
                               <w:rPr>
                                 <w:rFonts w:ascii="Sylfaen" w:hAnsi="Sylfaen"/>
@@ -2320,7 +2111,6 @@
                               </w:rPr>
                               <w:t>գումար</w:t>
                             </w:r>
-                            <w:proofErr w:type="spellEnd"/>
                           </w:p>
                         </w:txbxContent>
                       </wps:txbx>
@@ -2349,7 +2139,6 @@
                           <w:szCs w:val="15"/>
                         </w:rPr>
                       </w:pPr>
-                      <w:proofErr w:type="spellStart"/>
                       <w:r>
                         <w:rPr>
                           <w:rFonts w:ascii="Sylfaen" w:hAnsi="Sylfaen"/>
@@ -2358,7 +2147,6 @@
                         </w:rPr>
                         <w:t>գումար</w:t>
                       </w:r>
-                      <w:proofErr w:type="spellEnd"/>
                     </w:p>
                   </w:txbxContent>
                 </v:textbox>
@@ -2419,34 +2207,14 @@
                                 <w:szCs w:val="15"/>
                               </w:rPr>
                             </w:pPr>
-                            <w:proofErr w:type="spellStart"/>
                             <w:r>
                               <w:rPr>
                                 <w:rFonts w:ascii="Sylfaen" w:hAnsi="Sylfaen"/>
                                 <w:sz w:val="15"/>
                                 <w:szCs w:val="15"/>
                               </w:rPr>
-                              <w:t>գումարը</w:t>
+                              <w:t>գումարը բառերով</w:t>
                             </w:r>
-                            <w:proofErr w:type="spellEnd"/>
-                            <w:r>
-                              <w:rPr>
-                                <w:rFonts w:ascii="Sylfaen" w:hAnsi="Sylfaen"/>
-                                <w:sz w:val="15"/>
-                                <w:szCs w:val="15"/>
-                              </w:rPr>
-                              <w:t xml:space="preserve"> </w:t>
-                            </w:r>
-                            <w:proofErr w:type="spellStart"/>
-                            <w:r>
-                              <w:rPr>
-                                <w:rFonts w:ascii="Sylfaen" w:hAnsi="Sylfaen"/>
-                                <w:sz w:val="15"/>
-                                <w:szCs w:val="15"/>
-                              </w:rPr>
-                              <w:t>բառերով</w:t>
-                            </w:r>
-                            <w:proofErr w:type="spellEnd"/>
                           </w:p>
                         </w:txbxContent>
                       </wps:txbx>
@@ -2475,34 +2243,14 @@
                           <w:szCs w:val="15"/>
                         </w:rPr>
                       </w:pPr>
-                      <w:proofErr w:type="spellStart"/>
                       <w:r>
                         <w:rPr>
                           <w:rFonts w:ascii="Sylfaen" w:hAnsi="Sylfaen"/>
                           <w:sz w:val="15"/>
                           <w:szCs w:val="15"/>
                         </w:rPr>
-                        <w:t>գումարը</w:t>
+                        <w:t>գումարը բառերով</w:t>
                       </w:r>
-                      <w:proofErr w:type="spellEnd"/>
-                      <w:r>
-                        <w:rPr>
-                          <w:rFonts w:ascii="Sylfaen" w:hAnsi="Sylfaen"/>
-                          <w:sz w:val="15"/>
-                          <w:szCs w:val="15"/>
-                        </w:rPr>
-                        <w:t xml:space="preserve"> </w:t>
-                      </w:r>
-                      <w:proofErr w:type="spellStart"/>
-                      <w:r>
-                        <w:rPr>
-                          <w:rFonts w:ascii="Sylfaen" w:hAnsi="Sylfaen"/>
-                          <w:sz w:val="15"/>
-                          <w:szCs w:val="15"/>
-                        </w:rPr>
-                        <w:t>բառերով</w:t>
-                      </w:r>
-                      <w:proofErr w:type="spellEnd"/>
                     </w:p>
                   </w:txbxContent>
                 </v:textbox>
@@ -2569,7 +2317,7 @@
               </wp:anchor>
             </w:drawing>
           </mc:Choice>
-          <mc:Fallback xmlns:w16sdtfl="http://schemas.microsoft.com/office/word/2024/wordml/sdtformatlock" xmlns:w16du="http://schemas.microsoft.com/office/word/2023/wordml/word16du">
+          <mc:Fallback xmlns:w16du="http://schemas.microsoft.com/office/word/2023/wordml/word16du" xmlns:w16sdtfl="http://schemas.microsoft.com/office/word/2024/wordml/sdtformatlock">
             <w:pict>
               <v:line w14:anchorId="195C715A" id="Straight Connector 1" o:spid="_x0000_s1026" style="position:absolute;flip:x;z-index:251746816;visibility:visible;mso-wrap-style:square;mso-wrap-distance-left:9pt;mso-wrap-distance-top:0;mso-wrap-distance-right:9pt;mso-wrap-distance-bottom:0;mso-position-horizontal:absolute;mso-position-horizontal-relative:text;mso-position-vertical:absolute;mso-position-vertical-relative:text" from="-62.65pt,-40.1pt" to="-60.15pt,164.95pt" o:gfxdata="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" strokecolor="black [3200]" strokeweight=".5pt">
                 <v:shadow on="t" color="black" opacity="24903f" origin=",.5" offset="0,.55556mm"/>
@@ -2636,7 +2384,7 @@
               </wp:anchor>
             </w:drawing>
           </mc:Choice>
-          <mc:Fallback xmlns:w16sdtfl="http://schemas.microsoft.com/office/word/2024/wordml/sdtformatlock" xmlns:w16du="http://schemas.microsoft.com/office/word/2023/wordml/word16du">
+          <mc:Fallback xmlns:w16du="http://schemas.microsoft.com/office/word/2023/wordml/word16du" xmlns:w16sdtfl="http://schemas.microsoft.com/office/word/2024/wordml/sdtformatlock">
             <w:pict>
               <v:line w14:anchorId="3AD5B11D" id="Straight Connector 1" o:spid="_x0000_s1026" style="position:absolute;z-index:251747840;visibility:visible;mso-wrap-style:square;mso-wrap-distance-left:9pt;mso-wrap-distance-top:0;mso-wrap-distance-right:9pt;mso-wrap-distance-bottom:0;mso-position-horizontal:absolute;mso-position-horizontal-relative:text;mso-position-vertical:absolute;mso-position-vertical-relative:text" from="483.4pt,-41.25pt" to="483.65pt,165pt" o:gfxdata="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" strokecolor="black [3200]" strokeweight=".5pt">
                 <v:shadow on="t" color="black" opacity="24903f" origin=",.5" offset="0,.55556mm"/>
@@ -2703,7 +2451,7 @@
               </wp:anchor>
             </w:drawing>
           </mc:Choice>
-          <mc:Fallback xmlns:w16sdtfl="http://schemas.microsoft.com/office/word/2024/wordml/sdtformatlock" xmlns:w16du="http://schemas.microsoft.com/office/word/2023/wordml/word16du">
+          <mc:Fallback xmlns:w16du="http://schemas.microsoft.com/office/word/2023/wordml/word16du" xmlns:w16sdtfl="http://schemas.microsoft.com/office/word/2024/wordml/sdtformatlock">
             <w:pict>
               <v:line w14:anchorId="08A20EB7" id="Straight Connector 1" o:spid="_x0000_s1026" style="position:absolute;flip:x;z-index:251748864;visibility:visible;mso-wrap-style:square;mso-wrap-distance-left:9pt;mso-wrap-distance-top:0;mso-wrap-distance-right:9pt;mso-wrap-distance-bottom:0;mso-position-horizontal:absolute;mso-position-horizontal-relative:text;mso-position-vertical:absolute;mso-position-vertical-relative:text" from="-63.1pt,164.95pt" to="483.15pt,164.95pt" o:gfxdata="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" strokecolor="black [3200]" strokeweight=".5pt">
                 <v:shadow on="t" color="black" opacity="24903f" origin=",.5" offset="0,.55556mm"/>
@@ -2770,7 +2518,7 @@
               </wp:anchor>
             </w:drawing>
           </mc:Choice>
-          <mc:Fallback xmlns:w16sdtfl="http://schemas.microsoft.com/office/word/2024/wordml/sdtformatlock" xmlns:w16du="http://schemas.microsoft.com/office/word/2023/wordml/word16du">
+          <mc:Fallback xmlns:w16du="http://schemas.microsoft.com/office/word/2023/wordml/word16du" xmlns:w16sdtfl="http://schemas.microsoft.com/office/word/2024/wordml/sdtformatlock">
             <w:pict>
               <v:line w14:anchorId="1A29E772" id="Straight Connector 1" o:spid="_x0000_s1026" style="position:absolute;flip:x;z-index:251749888;visibility:visible;mso-wrap-style:square;mso-wrap-distance-left:9pt;mso-wrap-distance-top:0;mso-wrap-distance-right:9pt;mso-wrap-distance-bottom:0;mso-position-horizontal:absolute;mso-position-horizontal-relative:text;mso-position-vertical:absolute;mso-position-vertical-relative:text" from="-60.2pt,-40.1pt" to="111.85pt,-40.1pt" o:gfxdata="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" strokecolor="black [3200]" strokeweight=".5pt">
                 <v:shadow on="t" color="black" opacity="24903f" origin=",.5" offset="0,.55556mm"/>
@@ -2837,7 +2585,7 @@
               </wp:anchor>
             </w:drawing>
           </mc:Choice>
-          <mc:Fallback xmlns:w16sdtfl="http://schemas.microsoft.com/office/word/2024/wordml/sdtformatlock" xmlns:w16du="http://schemas.microsoft.com/office/word/2023/wordml/word16du">
+          <mc:Fallback xmlns:w16du="http://schemas.microsoft.com/office/word/2023/wordml/word16du" xmlns:w16sdtfl="http://schemas.microsoft.com/office/word/2024/wordml/sdtformatlock">
             <w:pict>
               <v:line w14:anchorId="01147BE1" id="Straight Connector 1" o:spid="_x0000_s1026" style="position:absolute;flip:x;z-index:251750912;visibility:visible;mso-wrap-style:square;mso-wrap-distance-left:9pt;mso-wrap-distance-top:0;mso-wrap-distance-right:9pt;mso-wrap-distance-bottom:0;mso-position-horizontal:absolute;mso-position-horizontal-relative:text;mso-position-vertical:absolute;mso-position-vertical-relative:text" from="318.5pt,-41.85pt" to="484.9pt,-41.35pt" o:gfxdata="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" strokecolor="black [3200]" strokeweight=".5pt">
                 <v:shadow on="t" color="black" opacity="24903f" origin=",.5" offset="0,.55556mm"/>
@@ -3266,23 +3014,13 @@
                                 <w:szCs w:val="18"/>
                               </w:rPr>
                             </w:pPr>
-                            <w:proofErr w:type="spellStart"/>
                             <w:r>
                               <w:rPr>
                                 <w:rFonts w:ascii="Sylfaen" w:hAnsi="Sylfaen"/>
                                 <w:sz w:val="18"/>
                                 <w:szCs w:val="18"/>
                               </w:rPr>
-                              <w:t>Ամսաթիվ</w:t>
-                            </w:r>
-                            <w:proofErr w:type="spellEnd"/>
-                            <w:r>
-                              <w:rPr>
-                                <w:rFonts w:ascii="Sylfaen" w:hAnsi="Sylfaen"/>
-                                <w:sz w:val="18"/>
-                                <w:szCs w:val="18"/>
-                              </w:rPr>
-                              <w:t xml:space="preserve">՝ </w:t>
+                              <w:t xml:space="preserve">Ամսաթիվ՝ </w:t>
                             </w:r>
                             <w:r>
                               <w:rPr>
@@ -3322,23 +3060,13 @@
                           <w:szCs w:val="18"/>
                         </w:rPr>
                       </w:pPr>
-                      <w:proofErr w:type="spellStart"/>
                       <w:r>
                         <w:rPr>
                           <w:rFonts w:ascii="Sylfaen" w:hAnsi="Sylfaen"/>
                           <w:sz w:val="18"/>
                           <w:szCs w:val="18"/>
                         </w:rPr>
-                        <w:t>Ամսաթիվ</w:t>
-                      </w:r>
-                      <w:proofErr w:type="spellEnd"/>
-                      <w:r>
-                        <w:rPr>
-                          <w:rFonts w:ascii="Sylfaen" w:hAnsi="Sylfaen"/>
-                          <w:sz w:val="18"/>
-                          <w:szCs w:val="18"/>
-                        </w:rPr>
-                        <w:t xml:space="preserve">՝ </w:t>
+                        <w:t xml:space="preserve">Ամսաթիվ՝ </w:t>
                       </w:r>
                       <w:r>
                         <w:rPr>
@@ -3581,25 +3309,7 @@
                                 <w:sz w:val="16"/>
                                 <w:szCs w:val="16"/>
                               </w:rPr>
-                              <w:t>${</w:t>
-                            </w:r>
-                            <w:proofErr w:type="spellStart"/>
-                            <w:r>
-                              <w:rPr>
-                                <w:rFonts w:ascii="Sylfaen" w:hAnsi="Sylfaen"/>
-                                <w:sz w:val="16"/>
-                                <w:szCs w:val="16"/>
-                              </w:rPr>
-                              <w:t>amount_text</w:t>
-                            </w:r>
-                            <w:proofErr w:type="spellEnd"/>
-                            <w:r>
-                              <w:rPr>
-                                <w:rFonts w:ascii="Sylfaen" w:hAnsi="Sylfaen"/>
-                                <w:sz w:val="16"/>
-                                <w:szCs w:val="16"/>
-                              </w:rPr>
-                              <w:t>}</w:t>
+                              <w:t>${amount_text}</w:t>
                             </w:r>
                             <w:r>
                               <w:rPr>
@@ -3648,25 +3358,7 @@
                           <w:sz w:val="16"/>
                           <w:szCs w:val="16"/>
                         </w:rPr>
-                        <w:t>${</w:t>
-                      </w:r>
-                      <w:proofErr w:type="spellStart"/>
-                      <w:r>
-                        <w:rPr>
-                          <w:rFonts w:ascii="Sylfaen" w:hAnsi="Sylfaen"/>
-                          <w:sz w:val="16"/>
-                          <w:szCs w:val="16"/>
-                        </w:rPr>
-                        <w:t>amount_text</w:t>
-                      </w:r>
-                      <w:proofErr w:type="spellEnd"/>
-                      <w:r>
-                        <w:rPr>
-                          <w:rFonts w:ascii="Sylfaen" w:hAnsi="Sylfaen"/>
-                          <w:sz w:val="16"/>
-                          <w:szCs w:val="16"/>
-                        </w:rPr>
-                        <w:t>}</w:t>
+                        <w:t>${amount_text}</w:t>
                       </w:r>
                       <w:r>
                         <w:rPr>
@@ -3749,18 +3441,8 @@
                                 <w:sz w:val="16"/>
                                 <w:szCs w:val="16"/>
                               </w:rPr>
-                              <w:t xml:space="preserve">ՀՀ </w:t>
+                              <w:t>ՀՀ դրամ</w:t>
                             </w:r>
-                            <w:proofErr w:type="spellStart"/>
-                            <w:r>
-                              <w:rPr>
-                                <w:rFonts w:ascii="Sylfaen" w:hAnsi="Sylfaen"/>
-                                <w:sz w:val="16"/>
-                                <w:szCs w:val="16"/>
-                              </w:rPr>
-                              <w:t>դրամ</w:t>
-                            </w:r>
-                            <w:proofErr w:type="spellEnd"/>
                           </w:p>
                         </w:txbxContent>
                       </wps:txbx>
@@ -3806,18 +3488,8 @@
                           <w:sz w:val="16"/>
                           <w:szCs w:val="16"/>
                         </w:rPr>
-                        <w:t xml:space="preserve">ՀՀ </w:t>
+                        <w:t>ՀՀ դրամ</w:t>
                       </w:r>
-                      <w:proofErr w:type="spellStart"/>
-                      <w:r>
-                        <w:rPr>
-                          <w:rFonts w:ascii="Sylfaen" w:hAnsi="Sylfaen"/>
-                          <w:sz w:val="16"/>
-                          <w:szCs w:val="16"/>
-                        </w:rPr>
-                        <w:t>դրամ</w:t>
-                      </w:r>
-                      <w:proofErr w:type="spellEnd"/>
                     </w:p>
                   </w:txbxContent>
                 </v:textbox>
@@ -3890,18 +3562,8 @@
                                 <w:sz w:val="16"/>
                                 <w:szCs w:val="16"/>
                               </w:rPr>
-                              <w:t xml:space="preserve">ՀՀ </w:t>
+                              <w:t>ՀՀ դրամ</w:t>
                             </w:r>
-                            <w:proofErr w:type="spellStart"/>
-                            <w:r>
-                              <w:rPr>
-                                <w:rFonts w:ascii="Sylfaen" w:hAnsi="Sylfaen"/>
-                                <w:sz w:val="16"/>
-                                <w:szCs w:val="16"/>
-                              </w:rPr>
-                              <w:t>դրամ</w:t>
-                            </w:r>
-                            <w:proofErr w:type="spellEnd"/>
                           </w:p>
                         </w:txbxContent>
                       </wps:txbx>
@@ -3944,18 +3606,8 @@
                           <w:sz w:val="16"/>
                           <w:szCs w:val="16"/>
                         </w:rPr>
-                        <w:t xml:space="preserve">ՀՀ </w:t>
+                        <w:t>ՀՀ դրամ</w:t>
                       </w:r>
-                      <w:proofErr w:type="spellStart"/>
-                      <w:r>
-                        <w:rPr>
-                          <w:rFonts w:ascii="Sylfaen" w:hAnsi="Sylfaen"/>
-                          <w:sz w:val="16"/>
-                          <w:szCs w:val="16"/>
-                        </w:rPr>
-                        <w:t>դրամ</w:t>
-                      </w:r>
-                      <w:proofErr w:type="spellEnd"/>
                     </w:p>
                   </w:txbxContent>
                 </v:textbox>
@@ -4021,25 +3673,7 @@
                                 <w:sz w:val="16"/>
                                 <w:szCs w:val="16"/>
                               </w:rPr>
-                              <w:t>${</w:t>
-                            </w:r>
-                            <w:proofErr w:type="spellStart"/>
-                            <w:r>
-                              <w:rPr>
-                                <w:rFonts w:ascii="Sylfaen" w:hAnsi="Sylfaen"/>
-                                <w:sz w:val="16"/>
-                                <w:szCs w:val="16"/>
-                              </w:rPr>
-                              <w:t>amount_text</w:t>
-                            </w:r>
-                            <w:proofErr w:type="spellEnd"/>
-                            <w:r>
-                              <w:rPr>
-                                <w:rFonts w:ascii="Sylfaen" w:hAnsi="Sylfaen"/>
-                                <w:sz w:val="16"/>
-                                <w:szCs w:val="16"/>
-                              </w:rPr>
-                              <w:t>}</w:t>
+                              <w:t>${amount_text}</w:t>
                             </w:r>
                             <w:r>
                               <w:rPr>
@@ -4093,25 +3727,7 @@
                           <w:sz w:val="16"/>
                           <w:szCs w:val="16"/>
                         </w:rPr>
-                        <w:t>${</w:t>
-                      </w:r>
-                      <w:proofErr w:type="spellStart"/>
-                      <w:r>
-                        <w:rPr>
-                          <w:rFonts w:ascii="Sylfaen" w:hAnsi="Sylfaen"/>
-                          <w:sz w:val="16"/>
-                          <w:szCs w:val="16"/>
-                        </w:rPr>
-                        <w:t>amount_text</w:t>
-                      </w:r>
-                      <w:proofErr w:type="spellEnd"/>
-                      <w:r>
-                        <w:rPr>
-                          <w:rFonts w:ascii="Sylfaen" w:hAnsi="Sylfaen"/>
-                          <w:sz w:val="16"/>
-                          <w:szCs w:val="16"/>
-                        </w:rPr>
-                        <w:t>}</w:t>
+                        <w:t>${amount_text}</w:t>
                       </w:r>
                       <w:r>
                         <w:rPr>
@@ -4193,23 +3809,13 @@
         </w:rPr>
         <w:br/>
       </w:r>
-      <w:proofErr w:type="spellStart"/>
       <w:r>
         <w:rPr>
           <w:rFonts w:ascii="Sylfaen" w:hAnsi="Sylfaen"/>
           <w:sz w:val="20"/>
           <w:szCs w:val="20"/>
         </w:rPr>
-        <w:t>Պայմանագրի</w:t>
-      </w:r>
-      <w:proofErr w:type="spellEnd"/>
-      <w:r>
-        <w:rPr>
-          <w:rFonts w:ascii="Sylfaen" w:hAnsi="Sylfaen"/>
-          <w:sz w:val="20"/>
-          <w:szCs w:val="20"/>
-        </w:rPr>
-        <w:t xml:space="preserve"> N </w:t>
+        <w:t xml:space="preserve">Պայմանագրի N </w:t>
       </w:r>
       <w:r>
         <w:rPr>
@@ -4230,7 +3836,6 @@
         </w:rPr>
         <w:t>${</w:t>
       </w:r>
-      <w:proofErr w:type="spellStart"/>
       <w:r>
         <w:rPr>
           <w:rFonts w:ascii="Sylfaen" w:eastAsia="Times New Roman" w:hAnsi="Sylfaen" w:cs="Times New Roman"/>
@@ -4243,7 +3848,6 @@
         </w:rPr>
         <w:t>num</w:t>
       </w:r>
-      <w:proofErr w:type="spellEnd"/>
       <w:r>
         <w:rPr>
           <w:rFonts w:ascii="Sylfaen" w:eastAsia="Times New Roman" w:hAnsi="Sylfaen" w:cs="Times New Roman"/>
@@ -4264,23 +3868,13 @@
         </w:rPr>
         <w:br/>
       </w:r>
-      <w:proofErr w:type="spellStart"/>
       <w:r>
         <w:rPr>
           <w:rFonts w:ascii="Sylfaen" w:hAnsi="Sylfaen"/>
           <w:sz w:val="20"/>
           <w:szCs w:val="20"/>
         </w:rPr>
-        <w:t>Նպատակ</w:t>
-      </w:r>
-      <w:proofErr w:type="spellEnd"/>
-      <w:r>
-        <w:rPr>
-          <w:rFonts w:ascii="Sylfaen" w:hAnsi="Sylfaen"/>
-          <w:sz w:val="20"/>
-          <w:szCs w:val="20"/>
-        </w:rPr>
-        <w:t xml:space="preserve"> </w:t>
+        <w:t xml:space="preserve">Նպատակ </w:t>
       </w:r>
       <w:r>
         <w:rPr>
@@ -4289,7 +3883,6 @@
         <w:br/>
         <w:t xml:space="preserve">  </w:t>
       </w:r>
-      <w:proofErr w:type="spellStart"/>
       <w:r>
         <w:rPr>
           <w:rFonts w:ascii="Sylfaen" w:hAnsi="Sylfaen"/>
@@ -4298,70 +3891,7 @@
           <w:i/>
           <w:iCs/>
         </w:rPr>
-        <w:t>Վարկային</w:t>
-      </w:r>
-      <w:proofErr w:type="spellEnd"/>
-      <w:r>
-        <w:rPr>
-          <w:rFonts w:ascii="Sylfaen" w:hAnsi="Sylfaen"/>
-          <w:b/>
-          <w:bCs/>
-          <w:i/>
-          <w:iCs/>
-        </w:rPr>
-        <w:t xml:space="preserve"> </w:t>
-      </w:r>
-      <w:proofErr w:type="spellStart"/>
-      <w:r>
-        <w:rPr>
-          <w:rFonts w:ascii="Sylfaen" w:hAnsi="Sylfaen"/>
-          <w:b/>
-          <w:bCs/>
-          <w:i/>
-          <w:iCs/>
-        </w:rPr>
-        <w:t>պայմանագրի</w:t>
-      </w:r>
-      <w:proofErr w:type="spellEnd"/>
-      <w:r>
-        <w:rPr>
-          <w:rFonts w:ascii="Sylfaen" w:hAnsi="Sylfaen"/>
-          <w:b/>
-          <w:bCs/>
-          <w:i/>
-          <w:iCs/>
-        </w:rPr>
-        <w:t xml:space="preserve"> </w:t>
-      </w:r>
-      <w:proofErr w:type="spellStart"/>
-      <w:r>
-        <w:rPr>
-          <w:rFonts w:ascii="Sylfaen" w:hAnsi="Sylfaen"/>
-          <w:b/>
-          <w:bCs/>
-          <w:i/>
-          <w:iCs/>
-        </w:rPr>
-        <w:t>կնքում</w:t>
-      </w:r>
-      <w:proofErr w:type="spellEnd"/>
-      <w:r>
-        <w:rPr>
-          <w:rFonts w:ascii="Sylfaen" w:hAnsi="Sylfaen"/>
-          <w:b/>
-          <w:bCs/>
-          <w:i/>
-          <w:iCs/>
-        </w:rPr>
-        <w:t xml:space="preserve"> </w:t>
-      </w:r>
-      <w:r>
-        <w:rPr>
-          <w:rFonts w:ascii="Sylfaen" w:hAnsi="Sylfaen"/>
-          <w:i/>
-          <w:iCs/>
-        </w:rPr>
-        <w:t xml:space="preserve"> </w:t>
+        <w:t>${purpose}</w:t>
       </w:r>
       <w:r>
         <w:rPr>
@@ -4371,7 +3901,6 @@
         </w:rPr>
         <w:br/>
       </w:r>
-      <w:proofErr w:type="spellStart"/>
       <w:r>
         <w:rPr>
           <w:rFonts w:ascii="Sylfaen" w:hAnsi="Sylfaen"/>
@@ -4380,7 +3909,6 @@
         </w:rPr>
         <w:t>Հիմք</w:t>
       </w:r>
-      <w:proofErr w:type="spellEnd"/>
       <w:r>
         <w:rPr>
           <w:rFonts w:ascii="Sylfaen" w:hAnsi="Sylfaen"/>
@@ -4417,24 +3945,7 @@
           <w:szCs w:val="20"/>
         </w:rPr>
         <w:br/>
-      </w:r>
-      <w:proofErr w:type="spellStart"/>
-      <w:r>
-        <w:rPr>
-          <w:rFonts w:ascii="Sylfaen" w:hAnsi="Sylfaen"/>
-          <w:sz w:val="20"/>
-          <w:szCs w:val="20"/>
-        </w:rPr>
-        <w:t>Կատարող</w:t>
-      </w:r>
-      <w:proofErr w:type="spellEnd"/>
-      <w:r>
-        <w:rPr>
-          <w:rFonts w:ascii="Sylfaen" w:hAnsi="Sylfaen"/>
-          <w:sz w:val="20"/>
-          <w:szCs w:val="20"/>
-        </w:rPr>
-        <w:t xml:space="preserve">՝ </w:t>
+        <w:t xml:space="preserve">Կատարող՝ </w:t>
       </w:r>
       <w:r>
         <w:rPr>
@@ -4548,23 +4059,13 @@
         </w:rPr>
         <w:br/>
       </w:r>
-      <w:proofErr w:type="spellStart"/>
       <w:r>
         <w:rPr>
           <w:rFonts w:ascii="Sylfaen" w:hAnsi="Sylfaen"/>
           <w:sz w:val="20"/>
           <w:szCs w:val="20"/>
         </w:rPr>
-        <w:t>Պայմանագրի</w:t>
-      </w:r>
-      <w:proofErr w:type="spellEnd"/>
-      <w:r>
-        <w:rPr>
-          <w:rFonts w:ascii="Sylfaen" w:hAnsi="Sylfaen"/>
-          <w:sz w:val="20"/>
-          <w:szCs w:val="20"/>
-        </w:rPr>
-        <w:t xml:space="preserve"> N </w:t>
+        <w:t xml:space="preserve">Պայմանագրի N </w:t>
       </w:r>
       <w:r>
         <w:rPr>
@@ -4594,33 +4095,7 @@
           <w:color w:val="000000" w:themeColor="text1"/>
           <w:lang w:val="en-GB"/>
         </w:rPr>
-        <w:t>${</w:t>
-      </w:r>
-      <w:proofErr w:type="spellStart"/>
-      <w:r>
-        <w:rPr>
-          <w:rFonts w:ascii="Sylfaen" w:eastAsia="Times New Roman" w:hAnsi="Sylfaen" w:cs="Times New Roman"/>
-          <w:b/>
-          <w:bCs/>
-          <w:i/>
-          <w:iCs/>
-          <w:color w:val="000000" w:themeColor="text1"/>
-          <w:lang w:val="en-GB"/>
-        </w:rPr>
-        <w:t>num</w:t>
-      </w:r>
-      <w:proofErr w:type="spellEnd"/>
-      <w:r>
-        <w:rPr>
-          <w:rFonts w:ascii="Sylfaen" w:eastAsia="Times New Roman" w:hAnsi="Sylfaen" w:cs="Times New Roman"/>
-          <w:b/>
-          <w:bCs/>
-          <w:i/>
-          <w:iCs/>
-          <w:color w:val="000000" w:themeColor="text1"/>
-          <w:lang w:val="en-GB"/>
-        </w:rPr>
-        <w:t>}</w:t>
+        <w:t>${num}</w:t>
       </w:r>
       <w:r>
         <w:rPr>
@@ -4630,23 +4105,13 @@
         </w:rPr>
         <w:br/>
       </w:r>
-      <w:proofErr w:type="spellStart"/>
       <w:r>
         <w:rPr>
           <w:rFonts w:ascii="Sylfaen" w:hAnsi="Sylfaen"/>
           <w:sz w:val="20"/>
           <w:szCs w:val="20"/>
         </w:rPr>
-        <w:t>Նպատակ</w:t>
-      </w:r>
-      <w:proofErr w:type="spellEnd"/>
-      <w:r>
-        <w:rPr>
-          <w:rFonts w:ascii="Sylfaen" w:hAnsi="Sylfaen"/>
-          <w:sz w:val="20"/>
-          <w:szCs w:val="20"/>
-        </w:rPr>
-        <w:t xml:space="preserve"> </w:t>
+        <w:t xml:space="preserve">Նպատակ </w:t>
       </w:r>
       <w:r>
         <w:rPr>
@@ -4655,7 +4120,6 @@
         <w:br/>
         <w:t xml:space="preserve">  </w:t>
       </w:r>
-      <w:proofErr w:type="spellStart"/>
       <w:r>
         <w:rPr>
           <w:rFonts w:ascii="Sylfaen" w:hAnsi="Sylfaen"/>
@@ -4664,70 +4128,7 @@
           <w:i/>
           <w:iCs/>
         </w:rPr>
-        <w:t>Վարկային</w:t>
-      </w:r>
-      <w:proofErr w:type="spellEnd"/>
-      <w:r>
-        <w:rPr>
-          <w:rFonts w:ascii="Sylfaen" w:hAnsi="Sylfaen"/>
-          <w:b/>
-          <w:bCs/>
-          <w:i/>
-          <w:iCs/>
-        </w:rPr>
-        <w:t xml:space="preserve"> </w:t>
-      </w:r>
-      <w:proofErr w:type="spellStart"/>
-      <w:r>
-        <w:rPr>
-          <w:rFonts w:ascii="Sylfaen" w:hAnsi="Sylfaen"/>
-          <w:b/>
-          <w:bCs/>
-          <w:i/>
-          <w:iCs/>
-        </w:rPr>
-        <w:t>պայմանագրի</w:t>
-      </w:r>
-      <w:proofErr w:type="spellEnd"/>
-      <w:r>
-        <w:rPr>
-          <w:rFonts w:ascii="Sylfaen" w:hAnsi="Sylfaen"/>
-          <w:b/>
-          <w:bCs/>
-          <w:i/>
-          <w:iCs/>
-        </w:rPr>
-        <w:t xml:space="preserve"> </w:t>
-      </w:r>
-      <w:proofErr w:type="spellStart"/>
-      <w:r>
-        <w:rPr>
-          <w:rFonts w:ascii="Sylfaen" w:hAnsi="Sylfaen"/>
-          <w:b/>
-          <w:bCs/>
-          <w:i/>
-          <w:iCs/>
-        </w:rPr>
-        <w:t>կնքում</w:t>
-      </w:r>
-      <w:proofErr w:type="spellEnd"/>
-      <w:r>
-        <w:rPr>
-          <w:rFonts w:ascii="Sylfaen" w:hAnsi="Sylfaen"/>
-          <w:b/>
-          <w:bCs/>
-          <w:i/>
-          <w:iCs/>
-        </w:rPr>
-        <w:t xml:space="preserve"> </w:t>
-      </w:r>
-      <w:r>
-        <w:rPr>
-          <w:rFonts w:ascii="Sylfaen" w:hAnsi="Sylfaen"/>
-          <w:i/>
-          <w:iCs/>
-        </w:rPr>
-        <w:t xml:space="preserve"> </w:t>
+        <w:t>${purpose}</w:t>
       </w:r>
       <w:r>
         <w:rPr>
@@ -4737,7 +4138,6 @@
         </w:rPr>
         <w:br/>
       </w:r>
-      <w:proofErr w:type="spellStart"/>
       <w:r>
         <w:rPr>
           <w:rFonts w:ascii="Sylfaen" w:hAnsi="Sylfaen"/>
@@ -4746,7 +4146,6 @@
         </w:rPr>
         <w:t>Հիմք</w:t>
       </w:r>
-      <w:proofErr w:type="spellEnd"/>
       <w:r>
         <w:rPr>
           <w:rFonts w:ascii="Sylfaen" w:hAnsi="Sylfaen"/>
@@ -4796,24 +4195,7 @@
           <w:szCs w:val="20"/>
         </w:rPr>
         <w:br/>
-      </w:r>
-      <w:proofErr w:type="spellStart"/>
-      <w:r>
-        <w:rPr>
-          <w:rFonts w:ascii="Sylfaen" w:hAnsi="Sylfaen"/>
-          <w:sz w:val="20"/>
-          <w:szCs w:val="20"/>
-        </w:rPr>
-        <w:t>Կատարող</w:t>
-      </w:r>
-      <w:proofErr w:type="spellEnd"/>
-      <w:r>
-        <w:rPr>
-          <w:rFonts w:ascii="Sylfaen" w:hAnsi="Sylfaen"/>
-          <w:sz w:val="20"/>
-          <w:szCs w:val="20"/>
-        </w:rPr>
-        <w:t xml:space="preserve">՝ </w:t>
+        <w:t xml:space="preserve">Կատարող՝ </w:t>
       </w:r>
       <w:r>
         <w:rPr>

</xml_diff>